<commit_message>
Add graphical abstract files and caption
- Created a new LaTeX file for the graphical abstract layout, detailing the conceptual diagram with panels illustrating forgeable certification, nonlinear multistability, and diagnostic outcomes.
- Added a PNG image of the graphical abstract generated by OpenAI's image-generation system.
- Included a caption text file explaining the graphical abstract's content and context, emphasizing the conceptual nature of the diagram and the verification of scientific labels by the authors.
</commit_message>
<xml_diff>
--- a/paper-csf/declaration_of_interest.docx
+++ b/paper-csf/declaration_of_interest.docx
@@ -18,7 +18,7 @@
         <w:t xml:space="preserve">Manuscript title: </w:t>
       </w:r>
       <w:r>
-        <w:t>Forgeable greenbeards: bistability and hollow collapse in the evolutionary dynamics of certified agent populations</w:t>
+        <w:t>Forgeable greenbeards: multistability and hollow collapse in certified agent populations</w:t>
       </w:r>
     </w:p>
     <w:p>
@@ -49,7 +49,7 @@
     </w:p>
     <w:p>
       <w:r>
-        <w:t>During the preparation of this work the authors used a large language model assistant in order to draft and edit prose, to scaffold parts of the analysis code, and to check the consistency of quoted numerical values against the generated results files. After using this tool the authors reviewed and edited the content as needed and take full responsibility for the content of the published article.</w:t>
+        <w:t>During the preparation of this work the authors used Anthropic's Claude through the Claude Code command-line interface and OpenAI Codex to draft and edit prose, inspect and revise the LaTeX source, scaffold parts of the analysis code, and check quoted numerical values against the generated results files. The authors also used OpenAI's image-generation system to render the graphical abstract from an author-specified four-panel scientific layout. The graphical abstract is conceptual and contains no simulated or empirical data. The authors reviewed and edited all tool output, verified every scientific label, and take full responsibility for the content of the published article.</w:t>
       </w:r>
     </w:p>
     <w:sectPr>

</xml_diff>